<commit_message>
refactor(report): remove rule fallback path; LLM planner is now sole outline source
- Delete _outline_legacy.py + _kpi_extractor.py (KPIItem moved to _outline.py)
- Inline _convert_item / _infer_role into _outline_planner.py
- Drop REPORT_OUTLINE_PLANNER_ENABLED flag and try/except fallback block
- LLM failures now raise _LLMPlannerFailure instead of silently degrading
- Rewrite baseline harness: stub_planner_llm replaces freeze_kpis;
  regen 4 golden fixtures against frozen LLM response
- Convert "falls_back" tests to pytest.raises(_LLMPlannerFailure)
- Mark Step 12 closure in spec/refactor_report_outline.md and prune
  ~170 lines of obsolete Step 8/9 implementation detail

Co-Authored-By: Claude Opus 4.7 (1M context) <noreply@anthropic.com>
</commit_message>
<xml_diff>
--- a/tests/fixtures/report_baseline/normal/golden.docx
+++ b/tests/fixtures/report_baseline/normal/golden.docx
@@ -241,6 +241,51 @@
         <w:pStyle w:val="Heading2"/>
       </w:pPr>
       <w:r>
+        <w:t>港区吞吐量</w:t>
+      </w:r>
+    </w:p>
+    <w:p>
+      <w:r>
+        <w:drawing>
+          <wp:inline xmlns:a="http://schemas.openxmlformats.org/drawingml/2006/main" xmlns:pic="http://schemas.openxmlformats.org/drawingml/2006/picture">
+            <wp:extent cx="5486400" cy="3161654"/>
+            <wp:docPr id="1" name="Picture 1"/>
+            <wp:cNvGraphicFramePr>
+              <a:graphicFrameLocks noChangeAspect="1"/>
+            </wp:cNvGraphicFramePr>
+            <a:graphic>
+              <a:graphicData uri="http://schemas.openxmlformats.org/drawingml/2006/picture">
+                <pic:pic>
+                  <pic:nvPicPr>
+                    <pic:cNvPr id="0" name="image.png"/>
+                    <pic:cNvPicPr/>
+                  </pic:nvPicPr>
+                  <pic:blipFill>
+                    <a:blip r:embed="rId11"/>
+                    <a:stretch>
+                      <a:fillRect/>
+                    </a:stretch>
+                  </pic:blipFill>
+                  <pic:spPr>
+                    <a:xfrm>
+                      <a:off x="0" y="0"/>
+                      <a:ext cx="5486400" cy="3161654"/>
+                    </a:xfrm>
+                    <a:prstGeom prst="rect"/>
+                  </pic:spPr>
+                </pic:pic>
+              </a:graphicData>
+            </a:graphic>
+          </wp:inline>
+        </w:drawing>
+      </w:r>
+    </w:p>
+    <w:p/>
+    <w:p>
+      <w:pPr>
+        <w:pStyle w:val="Heading2"/>
+      </w:pPr>
+      <w:r>
         <w:t>数据明细</w:t>
       </w:r>
     </w:p>
@@ -385,59 +430,6 @@
     <w:p/>
     <w:p>
       <w:pPr>
-        <w:pStyle w:val="Heading2"/>
-      </w:pPr>
-      <w:r>
-        <w:t>港区吞吐量</w:t>
-      </w:r>
-    </w:p>
-    <w:p>
-      <w:r>
-        <w:drawing>
-          <wp:inline xmlns:a="http://schemas.openxmlformats.org/drawingml/2006/main" xmlns:pic="http://schemas.openxmlformats.org/drawingml/2006/picture">
-            <wp:extent cx="5486400" cy="3161654"/>
-            <wp:docPr id="1" name="Picture 1"/>
-            <wp:cNvGraphicFramePr>
-              <a:graphicFrameLocks noChangeAspect="1"/>
-            </wp:cNvGraphicFramePr>
-            <a:graphic>
-              <a:graphicData uri="http://schemas.openxmlformats.org/drawingml/2006/picture">
-                <pic:pic>
-                  <pic:nvPicPr>
-                    <pic:cNvPr id="0" name="image.png"/>
-                    <pic:cNvPicPr/>
-                  </pic:nvPicPr>
-                  <pic:blipFill>
-                    <a:blip r:embed="rId11"/>
-                    <a:stretch>
-                      <a:fillRect/>
-                    </a:stretch>
-                  </pic:blipFill>
-                  <pic:spPr>
-                    <a:xfrm>
-                      <a:off x="0" y="0"/>
-                      <a:ext cx="5486400" cy="3161654"/>
-                    </a:xfrm>
-                    <a:prstGeom prst="rect"/>
-                  </pic:spPr>
-                </pic:pic>
-              </a:graphicData>
-            </a:graphic>
-          </wp:inline>
-        </w:drawing>
-      </w:r>
-    </w:p>
-    <w:p/>
-    <w:p>
-      <w:pPr>
-        <w:pStyle w:val="Heading1"/>
-      </w:pPr>
-      <w:r>
-        <w:t>二、关键指标分析</w:t>
-      </w:r>
-    </w:p>
-    <w:p>
-      <w:pPr>
         <w:ind w:firstLine="425"/>
       </w:pPr>
       <w:r>
@@ -446,6 +438,14 @@
           <w:sz w:val="24"/>
         </w:rPr>
         <w:t>2026 Q1 大连港吞吐量达 4500.5 万吨，同比增长 12%，居三港之首；营口港 3200.1 万吨，锦州港 1800.0 万吨。</w:t>
+      </w:r>
+    </w:p>
+    <w:p>
+      <w:pPr>
+        <w:pStyle w:val="Heading1"/>
+      </w:pPr>
+      <w:r>
+        <w:t>二、关键指标分析</w:t>
       </w:r>
     </w:p>
     <w:p>
@@ -707,21 +707,14 @@
     </w:p>
     <w:p>
       <w:pPr>
-        <w:pStyle w:val="Heading1"/>
-      </w:pPr>
-      <w:r>
-        <w:t>总结与建议</w:t>
-      </w:r>
-    </w:p>
-    <w:p>
-      <w:pPr>
         <w:ind w:firstLine="425"/>
       </w:pPr>
       <w:r>
         <w:rPr>
+          <w:rFonts w:ascii="Microsoft YaHei" w:hAnsi="Microsoft YaHei"/>
           <w:sz w:val="24"/>
         </w:rPr>
-        <w:t xml:space="preserve">  三港区集装箱吞吐量整体稳健增长，大连港持续领跑。</w:t>
+        <w:t>三港区集装箱吞吐量整体稳健增长，大连港持续领跑。</w:t>
       </w:r>
     </w:p>
     <w:sectPr>

</xml_diff>